<commit_message>
OV07 v2: rebuild off the disallowed AI wound photo onto the embedded-wrong-closure engine (Larry 2026-06-18 send-back). Subordinate home health suitability screen wrongly closes the wound as routine/home-health-adequate; started appeal is a true placeholder; golden-OV07-v2 rejects the closure and builds skilled need from the documented undermining, offloading failure, caregiver gap, IV antibiotics. Grader+prompt scrubbed of image language; v1 image/spec/golden-v1 archived. verify_ondina+presubmit+voice green; golden satisfies Section A. Awaiting re-pilot
</commit_message>
<xml_diff>
--- a/worlds/ondina-vasquell/tasks/task7/current/transfer_day_nursing_note_05242026.docx
+++ b/worlds/ondina-vasquell/tasks/task7/current/transfer_day_nursing_note_05242026.docx
@@ -214,7 +214,7 @@
                 <w:color w:val="232830"/>
                 <w:sz w:val="16"/>
               </w:rPr>
-              <w:t>Floor Nursing and Wound Care</w:t>
+              <w:t>Wound Care Nursing</w:t>
             </w:r>
           </w:p>
         </w:tc>
@@ -288,7 +288,7 @@
           <w:color w:val="1F3864"/>
           <w:sz w:val="28"/>
         </w:rPr>
-        <w:t>TRANSFER-DAY NURSING NOTE</w:t>
+        <w:t>TRANSFER-DAY WOUND CARE NURSING NOTE</w:t>
       </w:r>
     </w:p>
     <w:p>
@@ -300,7 +300,7 @@
           <w:color w:val="5E6670"/>
           <w:sz w:val="16"/>
         </w:rPr>
-        <w:t>Author: Floor Nursing and Wound Care | Date of Service: 05/24/2026 | Status: Routine</w:t>
+        <w:t>Author: Wound Care Nursing | Date of Service: 05/24/2026 | Status: Active</w:t>
       </w:r>
     </w:p>
     <w:p>
@@ -550,7 +550,7 @@
           <w:color w:val="232830"/>
           <w:sz w:val="19"/>
         </w:rPr>
-        <w:t>Routine transfer-day care. Patient comfortable, no acute distress. Left forefoot dressing change done by wound care this morning; offloading boot on. Vital signs stable per flowsheet.</w:t>
+        <w:t>Transfer-day wound reassessment by wound care. Left forefoot ulcer over the first to second metatarsal head, approximately 3 cm, granulating base, no exposed bone.</w:t>
       </w:r>
     </w:p>
     <w:p>
@@ -562,7 +562,7 @@
           <w:color w:val="232830"/>
           <w:sz w:val="19"/>
         </w:rPr>
-        <w:t>The left forefoot wound was re-photographed at transfer per wound care, and the image was added to the chart for the team to review before the level-of-care decision. Spanish interpreter used. Transfer paperwork in progress.</w:t>
+        <w:t>New on today's reassessment: undermining 2.0 cm at the proximal margin, tracking proximally, probe to bone negative. The undermined tract requires skilled packing and serial wound-nurse assessment. Offloading boot on; occupational therapy teach-back for offloading and dressing protection was not achieved. Patient continues on intravenous antibiotics per the medication record. Spanish interpreter used.</w:t>
       </w:r>
     </w:p>
     <w:p>
@@ -580,7 +580,7 @@
           <w:color w:val="5E6670"/>
           <w:sz w:val="18"/>
         </w:rPr>
-        <w:t>Floor Nursing and Wound Care, 05/24/2026</w:t>
+        <w:t>Wound Care Nursing, 05/24/2026</w:t>
       </w:r>
     </w:p>
     <w:sectPr>

</xml_diff>